<commit_message>
Fig 4.4: restore site x form pattern rule (Sys-TG n = 74)
TTU counts as IHG, so STG+TTU and EHG+TTU are growth-only systemic
progression and belong to Sys-TG. Remove the earlier-rule sensitivity
analysis, rerun all results (B = 1000, reference Sys-TG) and update the
Word explanation, Methods and README.

Co-Authored-By: Claude Opus 5.5 <noreply@anthropic.com>
Claude-Session: https://claude.ai/code/session_018X5WB1CosayYDZiSC4mTmS
</commit_message>
<xml_diff>
--- a/Fig4.4/Fig4.4_结果说明.docx
+++ b/Fig4.4/Fig4.4_结果说明.docx
@@ -247,7 +247,7 @@
         <w:rPr>
           <w:rFonts w:ascii="Arial" w:cs="Arial" w:eastAsia="Microsoft YaHei" w:hAnsi="Arial"/>
         </w:rPr>
-        <w:t xml:space="preserve">：进展后 12 个月调整后全因死亡累积发生率（CIF）从 IH-NL 的 58.0% 到 Sys-TG 的 77.5%，全人群标准化平均为 66.2%。各模式中肝内 HCC 死亡均为最主要死因；系统性 HCC 死亡集中在 Sys 类模式（12 个月 CIF 24–26%，而 IH 类约 10%）。</w:t>
+        <w:t xml:space="preserve">：进展后 12 个月调整后全因死亡累积发生率（CIF）从 IH-NL 的 57.9% 到 Sys-TG 的 79.1%，全人群标准化平均为 66.1%。各模式中肝内 HCC 死亡均为最主要死因；系统性 HCC 死亡集中在 Sys 类模式（12 个月 CIF 24–26%，而 IH 类约 10%）。</w:t>
       </w:r>
     </w:p>
     <w:p>
@@ -271,7 +271,7 @@
         <w:rPr>
           <w:rFonts w:ascii="Arial" w:cs="Arial" w:eastAsia="Microsoft YaHei" w:hAnsi="Arial"/>
         </w:rPr>
-        <w:t xml:space="preserve">：与人群标准化平均相比，IH-NL（−8.2 个百分点）和 IH-TG（−4.1）全因死亡更低；EH-TG（+8.8）、Sys-NL（+7.9）、Sys-TG+NL（+9.1）更高。系统性 HCC 死亡在三种 Sys 模式中均高出约 9–11 个百分点。</w:t>
+        <w:t xml:space="preserve">：与人群标准化平均相比，IH-NL（−8.2 个百分点）和 IH-TG（−4.1）全因死亡更低；Sys-TG（+13.0）、EH-TG（+8.8）、Sys-TG+NL（+8.2）、Sys-NL（+7.9）更高。系统性 HCC 死亡在三种 Sys 模式中均高出约 9–11 个百分点。</w:t>
       </w:r>
     </w:p>
     <w:p>
@@ -295,7 +295,7 @@
         <w:rPr>
           <w:rFonts w:ascii="Arial" w:cs="Arial" w:eastAsia="Microsoft YaHei" w:hAnsi="Arial"/>
         </w:rPr>
-        <w:t xml:space="preserve">：IH 类模式中约 70% 的死亡为肝内 HCC 死亡（PMR 1.12–1.18）；Sys 类模式中系统性 HCC 死亡占比约 1/3（Sys-TG+NL PMR 1.48）；Sys-NL 的肝外 HCC 死亡占比富集（PMR 1.89）。构成在 6、12、24 个月基本稳定。</w:t>
+        <w:t xml:space="preserve">：IH 类模式中约 70% 的死亡为肝内 HCC 死亡（PMR 1.12–1.18）；Sys 类模式中系统性 HCC 死亡约占 1/3（Sys-TG+NL PMR 1.51）；Sys-NL 的肝外 HCC 死亡富集（PMR 1.89）。死因构成在 6、12、24 个月基本稳定。</w:t>
       </w:r>
     </w:p>
     <w:p>
@@ -319,7 +319,7 @@
         <w:rPr>
           <w:rFonts w:ascii="Arial" w:cs="Arial" w:eastAsia="Microsoft YaHei" w:hAnsi="Arial"/>
         </w:rPr>
-        <w:t xml:space="preserve">：IH-TG、IH-NL、EH-NL 的全因死亡风险显著低于 Sys-TG（csHR 0.50–0.62）；所有 IH 类和 EH-TG、EH-NL 的系统性 HCC 死亡风险显著低于 Sys-TG（csHR 0.24–0.49），而 Sys-NL、Sys-TG+NL 与 Sys-TG 相近。整体 Wald 检验（与参照无关）：全因、肝内、肝外、系统性死亡均 P &lt; 0.001，Non-HCC 死亡 P = 0.41。</w:t>
+        <w:t xml:space="preserve">：IH-TG、IH-NL、EH-NL 的全因死亡风险显著低于 Sys-TG（HR 0.46–0.58）；所有 IH 类模式和 EH-TG、EH-NL 的系统性 HCC 死亡风险显著低于 Sys-TG（csHR 0.24–0.48），而 Sys-NL、Sys-TG+NL 与 Sys-TG 相近。整体 Wald 检验（与参照无关）：全因、肝内、肝外、系统性死亡均 P &lt; 0.001，Non-HCC 死亡 P = 0.40。</w:t>
       </w:r>
     </w:p>
     <w:p>
@@ -343,7 +343,7 @@
         <w:rPr>
           <w:rFonts w:ascii="Arial" w:cs="Arial" w:eastAsia="Microsoft YaHei" w:hAnsi="Arial"/>
         </w:rPr>
-        <w:t xml:space="preserve">：Lunn–McNeil 检验显示进展模式对三种 HCC 相关死因的作用不同（χ²(16) = 60.2，P &lt; 0.001）；这种差异主要由进展</w:t>
+        <w:t xml:space="preserve">：Lunn–McNeil 检验显示，进展模式对三种 HCC 相关死因的作用不同（χ²(16) = 60.5，P &lt; 0.001）。这种差异主要由进展</w:t>
       </w:r>
       <w:r>
         <w:rPr>
@@ -357,7 +357,7 @@
         <w:rPr>
           <w:rFonts w:ascii="Arial" w:cs="Arial" w:eastAsia="Microsoft YaHei" w:hAnsi="Arial"/>
         </w:rPr>
-        <w:t xml:space="preserve">驱动（部位 × 死因 χ²(4) = 48.8，P &lt; 0.001），而非 TG/NL </w:t>
+        <w:t xml:space="preserve">决定（部位 × 死因 χ²(4) = 48.6，P &lt; 0.001），与 TG/NL </w:t>
       </w:r>
       <w:r>
         <w:rPr>
@@ -371,7 +371,7 @@
         <w:rPr>
           <w:rFonts w:ascii="Arial" w:cs="Arial" w:eastAsia="Microsoft YaHei" w:hAnsi="Arial"/>
         </w:rPr>
-        <w:t xml:space="preserve">（P = 0.10）。</w:t>
+        <w:t xml:space="preserve">关系不大（P = 0.12）。</w:t>
       </w:r>
     </w:p>
     <w:p>
@@ -395,7 +395,7 @@
         <w:rPr>
           <w:rFonts w:ascii="Arial" w:cs="Arial" w:eastAsia="Microsoft YaHei" w:hAnsi="Arial"/>
         </w:rPr>
-        <w:t xml:space="preserve">：排除死因无法判定者、纳入删除标记病例、Firth 惩罚回归、早期模式归类规则下，结论方向一致；进展部位与治疗组无显著交互（P = 0.14），支持三组合并分析。</w:t>
+        <w:t xml:space="preserve">：排除死因无法判定者、纳入删除标记病例、用 Firth 惩罚回归后，结论方向一致；进展部位与治疗组无显著交互（P = 0.13），支持三组合并分析。</w:t>
       </w:r>
     </w:p>
     <w:p>
@@ -1085,7 +1085,7 @@
                 <w:sz w:val="18"/>
                 <w:szCs w:val="18"/>
               </w:rPr>
-              <w:t xml:space="preserve">补充图 11 页：未调整 AJ、6/24 个月 CIF、6/24 个月 ARD 与 PMR、Firth、排除无法判定死因、纳入删除标记病例、早期归类规则</w:t>
+              <w:t xml:space="preserve">补充图 10 页：未调整 AJ、6/24 个月 CIF、6/24 个月 ARD 与 PMR、Firth、排除无法判定死因、纳入删除标记病例</w:t>
             </w:r>
           </w:p>
         </w:tc>
@@ -1217,7 +1217,7 @@
                 <w:sz w:val="18"/>
                 <w:szCs w:val="18"/>
               </w:rPr>
-              <w:t xml:space="preserve">所有估计值（CIF/ARD/Q/PMR/HR，含 95% CI 与事件数，6/12/24 个月）及各检验 P 值，共 27 个工作表</w:t>
+              <w:t xml:space="preserve">所有估计值（CIF/ARD/Q/PMR/HR，含 95% CI 与事件数，6/12/24 个月）及各检验 P 值</w:t>
             </w:r>
           </w:p>
         </w:tc>
@@ -1500,7 +1500,7 @@
         <w:rPr>
           <w:rFonts w:ascii="Arial" w:cs="Arial" w:eastAsia="Microsoft YaHei" w:hAnsi="Arial"/>
         </w:rPr>
-        <w:t xml:space="preserve">三种治疗合并分析，所有模型以 strata(Group) 分层（每组允许不同的基线风险），不比较治疗组间差异（该问题已在 4.2 回答）。部位 × 治疗组交互检验 P = 0.14、模式 × 治疗组 P = 0.072，支持合并。</w:t>
+        <w:t xml:space="preserve">三种治疗合并分析，所有模型以 strata(Group) 分层（每组允许不同的基线风险），不比较治疗组间差异（该问题已在 4.2 回答）。部位 × 治疗组交互检验 P = 0.13、模式 × 治疗组 P = 0.087，支持合并。</w:t>
       </w:r>
     </w:p>
     <w:p>
@@ -2157,7 +2157,69 @@
         <w:rPr>
           <w:rFonts w:ascii="Arial" w:cs="Arial" w:eastAsia="Microsoft YaHei" w:hAnsi="Arial"/>
         </w:rPr>
-        <w:t xml:space="preserve">按《解剖分类 × 肿瘤模式分类》文档：癌栓升级（TTU）并入肝内病灶增大（IHG），新发血管侵犯（nMVI）并入肝内新发病灶（NIH）。</w:t>
+        <w:t xml:space="preserve">按《解剖分类 × 肿瘤模式分类》文档：癌栓升级（TTU）并入肝内病灶增大（IHG），新发血管侵犯（nMVI）并入肝内新发病灶（NIH）。然后按</w:t>
+      </w:r>
+      <w:r>
+        <w:rPr>
+          <w:rFonts w:ascii="Arial" w:cs="Arial" w:eastAsia="Microsoft YaHei" w:hAnsi="Arial"/>
+          <w:b/>
+          <w:bCs/>
+        </w:rPr>
+        <w:t xml:space="preserve">部位 × 形式</w:t>
+      </w:r>
+      <w:r>
+        <w:rPr>
+          <w:rFonts w:ascii="Arial" w:cs="Arial" w:eastAsia="Microsoft YaHei" w:hAnsi="Arial"/>
+        </w:rPr>
+        <w:t xml:space="preserve">交叉归类：</w:t>
+      </w:r>
+    </w:p>
+    <w:p>
+      <w:pPr>
+        <w:pStyle w:val="ListParagraph"/>
+        <w:numPr>
+          <w:ilvl w:val="0"/>
+          <w:numId w:val="2"/>
+        </w:numPr>
+        <w:spacing w:after="60" w:line="290"/>
+      </w:pPr>
+      <w:r>
+        <w:rPr>
+          <w:rFonts w:ascii="Arial" w:cs="Arial" w:eastAsia="Microsoft YaHei" w:hAnsi="Arial"/>
+          <w:b/>
+          <w:bCs/>
+        </w:rPr>
+        <w:t xml:space="preserve">部位</w:t>
+      </w:r>
+      <w:r>
+        <w:rPr>
+          <w:rFonts w:ascii="Arial" w:cs="Arial" w:eastAsia="Microsoft YaHei" w:hAnsi="Arial"/>
+        </w:rPr>
+        <w:t xml:space="preserve">：出现系统性肿瘤增大（STG），或同时有肝内和肝外成分 → Sys；只有肝内成分 → IH；只有肝外成分 → EH。</w:t>
+      </w:r>
+    </w:p>
+    <w:p>
+      <w:pPr>
+        <w:pStyle w:val="ListParagraph"/>
+        <w:numPr>
+          <w:ilvl w:val="0"/>
+          <w:numId w:val="2"/>
+        </w:numPr>
+        <w:spacing w:after="60" w:line="290"/>
+      </w:pPr>
+      <w:r>
+        <w:rPr>
+          <w:rFonts w:ascii="Arial" w:cs="Arial" w:eastAsia="Microsoft YaHei" w:hAnsi="Arial"/>
+          <w:b/>
+          <w:bCs/>
+        </w:rPr>
+        <w:t xml:space="preserve">形式</w:t>
+      </w:r>
+      <w:r>
+        <w:rPr>
+          <w:rFonts w:ascii="Arial" w:cs="Arial" w:eastAsia="Microsoft YaHei" w:hAnsi="Arial"/>
+        </w:rPr>
+        <w:t xml:space="preserve">：只有增大类成分（IHG / EHG / STG）→ TG；只有新发类成分（NIH / NEH）→ NL；两者都有 → TG+NL。</w:t>
       </w:r>
     </w:p>
     <w:tbl>
@@ -2244,7 +2306,7 @@
                 <w:sz w:val="18"/>
                 <w:szCs w:val="18"/>
               </w:rPr>
-              <w:t xml:space="preserve">定义</w:t>
+              <w:t xml:space="preserve">包含的成分组合</w:t>
             </w:r>
           </w:p>
         </w:tc>
@@ -2376,7 +2438,7 @@
                 <w:sz w:val="18"/>
                 <w:szCs w:val="18"/>
               </w:rPr>
-              <w:t xml:space="preserve">仅 IHG</w:t>
+              <w:t xml:space="preserve">IHG（含 TTU）</w:t>
             </w:r>
           </w:p>
         </w:tc>
@@ -2506,7 +2568,7 @@
                 <w:sz w:val="18"/>
                 <w:szCs w:val="18"/>
               </w:rPr>
-              <w:t xml:space="preserve">仅 NIH</w:t>
+              <w:t xml:space="preserve">NIH（含 nMVI）</w:t>
             </w:r>
           </w:p>
         </w:tc>
@@ -2766,7 +2828,7 @@
                 <w:sz w:val="18"/>
                 <w:szCs w:val="18"/>
               </w:rPr>
-              <w:t xml:space="preserve">仅 EHG</w:t>
+              <w:t xml:space="preserve">EHG</w:t>
             </w:r>
           </w:p>
         </w:tc>
@@ -2896,7 +2958,7 @@
                 <w:sz w:val="18"/>
                 <w:szCs w:val="18"/>
               </w:rPr>
-              <w:t xml:space="preserve">仅 NEH</w:t>
+              <w:t xml:space="preserve">NEH</w:t>
             </w:r>
           </w:p>
         </w:tc>
@@ -3156,7 +3218,7 @@
                 <w:sz w:val="18"/>
                 <w:szCs w:val="18"/>
               </w:rPr>
-              <w:t xml:space="preserve">仅 STG</w:t>
+              <w:t xml:space="preserve">仅增大且涉及系统性：STG（52）、STG + TTU（14）、EHG + TTU（8）</w:t>
             </w:r>
           </w:p>
         </w:tc>
@@ -3188,7 +3250,7 @@
                 <w:sz w:val="18"/>
                 <w:szCs w:val="18"/>
               </w:rPr>
-              <w:t xml:space="preserve">52</w:t>
+              <w:t xml:space="preserve">74</w:t>
             </w:r>
           </w:p>
         </w:tc>
@@ -3220,7 +3282,7 @@
                 <w:sz w:val="18"/>
                 <w:szCs w:val="18"/>
               </w:rPr>
-              <w:t xml:space="preserve">39</w:t>
+              <w:t xml:space="preserve">58</w:t>
             </w:r>
           </w:p>
         </w:tc>
@@ -3416,7 +3478,7 @@
                 <w:sz w:val="18"/>
                 <w:szCs w:val="18"/>
               </w:rPr>
-              <w:t xml:space="preserve">其他所有组合（同时涉及肝内外 和/或 同时有增大与新发）</w:t>
+              <w:t xml:space="preserve">涉及系统性且同时有增大与新发（如 IHG + NEH、STG + NEH 等）</w:t>
             </w:r>
           </w:p>
         </w:tc>
@@ -3448,7 +3510,7 @@
                 <w:sz w:val="18"/>
                 <w:szCs w:val="18"/>
               </w:rPr>
-              <w:t xml:space="preserve">219</w:t>
+              <w:t xml:space="preserve">197</w:t>
             </w:r>
           </w:p>
         </w:tc>
@@ -3480,7 +3542,7 @@
                 <w:sz w:val="18"/>
                 <w:szCs w:val="18"/>
               </w:rPr>
-              <w:t xml:space="preserve">167</w:t>
+              <w:t xml:space="preserve">148</w:t>
             </w:r>
           </w:p>
         </w:tc>
@@ -3506,7 +3568,7 @@
           <w:sz w:val="19"/>
           <w:szCs w:val="19"/>
         </w:rPr>
-        <w:t xml:space="preserve">与早期规则相比有 22 例改判（STG + TTU 14 例、EHG + TTU 8 例：原 Sys-TG → 现 Sys-TG+NL）。早期规则得到 Sys-TG = 74 例，与原 HR 矩阵一致；其结果作为敏感性分析保留（补充图 figS_v0）。逐组合对照见 xlsx 的 Pattern_classification 表。</w:t>
+        <w:t xml:space="preserve">STG + TTU 和 EHG + TTU 按“TTU 属于 IHG”处理后均为仅增大的系统性进展，归入 Sys-TG（共 74 例），与原图一致。逐个成分组合的归类见 xlsx 的 Pattern_classification 表和汇总报告。</w:t>
       </w:r>
     </w:p>
     <w:p>
@@ -4203,7 +4265,7 @@
         <w:rPr>
           <w:rFonts w:ascii="Arial" w:cs="Arial" w:eastAsia="Microsoft YaHei" w:hAnsi="Arial"/>
         </w:rPr>
-        <w:t xml:space="preserve">① 对每种死因 j 拟合 cause-specific Cox 模型：Surv(PPOS, 死因 = j) ~ 模式 + TTP + 协变量 + strata(Group)；② 由各死因的 cs-Cox 合成个体 CIF：F_j(t) = Σ S(u−) dΛ_j(u)，S = exp(−Σ_j Λ_j)，因此各死因 CIF 之和自动等于全因死亡；③ G-computation（标准化）：把全部 1786 例进展患者的模式依次设为 k，保留各自协变量和治疗组，预测 12 个月 CIF 后取平均，得到标准化 CIF；④ 95% CI 为以患者为单位的非参数 bootstrap（1000 次，每次重新拟合全部模型）。自编 CIF 计算与 riskRegression::predictRisk 的差异为 7×10⁻¹⁶（数值一致）。</w:t>
+        <w:t xml:space="preserve">① 对每种死因 j 拟合 cause-specific Cox 模型：Surv(PPOS, 死因 = j) ~ 模式 + TTP + 协变量 + strata(Group)；② 由各死因的 cs-Cox 合成个体 CIF：F_j(t) = Σ S(u−) dΛ_j(u)，S = exp(−Σ_j Λ_j)，因此各死因 CIF 之和自动等于全因死亡；③ G-computation（标准化）：把全部 1786 例进展患者的模式依次设为 k，保留各自协变量和治疗组，预测 12 个月 CIF 后取平均，得到标准化 CIF；④ 95% CI 为以患者为单位的非参数 bootstrap（1000 次，每次重新拟合全部模型）。自编 CIF 计算与 riskRegression::predictRisk 的差异小于 10⁻¹⁵（数值一致）。</w:t>
       </w:r>
     </w:p>
     <w:p>
@@ -4587,7 +4649,7 @@
                 <w:sz w:val="18"/>
                 <w:szCs w:val="18"/>
               </w:rPr>
-              <w:t xml:space="preserve">77.5 (65.1–88.6)</w:t>
+              <w:t xml:space="preserve">79.1 (70.5–88.1)</w:t>
             </w:r>
           </w:p>
         </w:tc>
@@ -4619,7 +4681,7 @@
                 <w:sz w:val="18"/>
                 <w:szCs w:val="18"/>
               </w:rPr>
-              <w:t xml:space="preserve">43.5 (29.7–57.6)</w:t>
+              <w:t xml:space="preserve">46.6 (35.9–57.4)</w:t>
             </w:r>
           </w:p>
         </w:tc>
@@ -4651,7 +4713,7 @@
                 <w:sz w:val="18"/>
                 <w:szCs w:val="18"/>
               </w:rPr>
-              <w:t xml:space="preserve">4.1 (0.0–11.5)</w:t>
+              <w:t xml:space="preserve">4.6 (0.8–11.6)</w:t>
             </w:r>
           </w:p>
         </w:tc>
@@ -4683,7 +4745,7 @@
                 <w:sz w:val="18"/>
                 <w:szCs w:val="18"/>
               </w:rPr>
-              <w:t xml:space="preserve">26.4 (14.7–40.5)</w:t>
+              <w:t xml:space="preserve">25.4 (15.5–36.9)</w:t>
             </w:r>
           </w:p>
         </w:tc>
@@ -4715,7 +4777,7 @@
                 <w:sz w:val="18"/>
                 <w:szCs w:val="18"/>
               </w:rPr>
-              <w:t xml:space="preserve">3.2 (0.0–11.2)</w:t>
+              <w:t xml:space="preserve">2.3 (0.0–8.0)</w:t>
             </w:r>
           </w:p>
         </w:tc>
@@ -4813,7 +4875,7 @@
                 <w:sz w:val="18"/>
                 <w:szCs w:val="18"/>
               </w:rPr>
-              <w:t xml:space="preserve">36.1 (20.3–51.3)</w:t>
+              <w:t xml:space="preserve">36.1 (20.3–51.0)</w:t>
             </w:r>
           </w:p>
         </w:tc>
@@ -4877,7 +4939,7 @@
                 <w:sz w:val="18"/>
                 <w:szCs w:val="18"/>
               </w:rPr>
-              <w:t xml:space="preserve">17.1 (6.5–31.3)</w:t>
+              <w:t xml:space="preserve">17.2 (6.6–31.2)</w:t>
             </w:r>
           </w:p>
         </w:tc>
@@ -4909,7 +4971,7 @@
                 <w:sz w:val="18"/>
                 <w:szCs w:val="18"/>
               </w:rPr>
-              <w:t xml:space="preserve">12.5 (0.0–29.7)</w:t>
+              <w:t xml:space="preserve">12.4 (0.0–29.7)</w:t>
             </w:r>
           </w:p>
         </w:tc>
@@ -4943,7 +5005,7 @@
                 <w:sz w:val="18"/>
                 <w:szCs w:val="18"/>
               </w:rPr>
-              <w:t xml:space="preserve">Sys-TG+NL</w:t>
+              <w:t xml:space="preserve">EH-TG</w:t>
             </w:r>
           </w:p>
         </w:tc>
@@ -4975,7 +5037,7 @@
                 <w:sz w:val="18"/>
                 <w:szCs w:val="18"/>
               </w:rPr>
-              <w:t xml:space="preserve">75.2 (69.6–81.3)</w:t>
+              <w:t xml:space="preserve">74.9 (67.8–81.8)</w:t>
             </w:r>
           </w:p>
         </w:tc>
@@ -5007,7 +5069,7 @@
                 <w:sz w:val="18"/>
                 <w:szCs w:val="18"/>
               </w:rPr>
-              <w:t xml:space="preserve">39.0 (33.3–45.6)</w:t>
+              <w:t xml:space="preserve">47.0 (37.5–55.9)</w:t>
             </w:r>
           </w:p>
         </w:tc>
@@ -5039,7 +5101,7 @@
                 <w:sz w:val="18"/>
                 <w:szCs w:val="18"/>
               </w:rPr>
-              <w:t xml:space="preserve">7.3 (3.9–11.7)</w:t>
+              <w:t xml:space="preserve">10.1 (5.2–15.8)</w:t>
             </w:r>
           </w:p>
         </w:tc>
@@ -5071,7 +5133,7 @@
                 <w:sz w:val="18"/>
                 <w:szCs w:val="18"/>
               </w:rPr>
-              <w:t xml:space="preserve">25.3 (19.5–31.0)</w:t>
+              <w:t xml:space="preserve">14.2 (8.2–21.0)</w:t>
             </w:r>
           </w:p>
         </w:tc>
@@ -5103,7 +5165,7 @@
                 <w:sz w:val="18"/>
                 <w:szCs w:val="18"/>
               </w:rPr>
-              <w:t xml:space="preserve">3.3 (0.9–6.4)</w:t>
+              <w:t xml:space="preserve">3.3 (0.6–8.0)</w:t>
             </w:r>
           </w:p>
         </w:tc>
@@ -5137,7 +5199,7 @@
                 <w:sz w:val="18"/>
                 <w:szCs w:val="18"/>
               </w:rPr>
-              <w:t xml:space="preserve">EH-TG</w:t>
+              <w:t xml:space="preserve">Sys-TG+NL</w:t>
             </w:r>
           </w:p>
         </w:tc>
@@ -5169,7 +5231,7 @@
                 <w:sz w:val="18"/>
                 <w:szCs w:val="18"/>
               </w:rPr>
-              <w:t xml:space="preserve">74.9 (67.7–81.8)</w:t>
+              <w:t xml:space="preserve">74.3 (68.2–80.9)</w:t>
             </w:r>
           </w:p>
         </w:tc>
@@ -5201,7 +5263,7 @@
                 <w:sz w:val="18"/>
                 <w:szCs w:val="18"/>
               </w:rPr>
-              <w:t xml:space="preserve">47.0 (37.6–55.9)</w:t>
+              <w:t xml:space="preserve">37.4 (30.9–44.4)</w:t>
             </w:r>
           </w:p>
         </w:tc>
@@ -5233,7 +5295,7 @@
                 <w:sz w:val="18"/>
                 <w:szCs w:val="18"/>
               </w:rPr>
-              <w:t xml:space="preserve">10.1 (5.2–15.8)</w:t>
+              <w:t xml:space="preserve">7.4 (3.8–11.7)</w:t>
             </w:r>
           </w:p>
         </w:tc>
@@ -5265,7 +5327,7 @@
                 <w:sz w:val="18"/>
                 <w:szCs w:val="18"/>
               </w:rPr>
-              <w:t xml:space="preserve">14.2 (8.2–21.1)</w:t>
+              <w:t xml:space="preserve">25.6 (19.6–31.8)</w:t>
             </w:r>
           </w:p>
         </w:tc>
@@ -5297,7 +5359,7 @@
                 <w:sz w:val="18"/>
                 <w:szCs w:val="18"/>
               </w:rPr>
-              <w:t xml:space="preserve">3.3 (0.6–8.0)</w:t>
+              <w:t xml:space="preserve">3.6 (1.0–7.0)</w:t>
             </w:r>
           </w:p>
         </w:tc>
@@ -5363,7 +5425,7 @@
                 <w:sz w:val="18"/>
                 <w:szCs w:val="18"/>
               </w:rPr>
-              <w:t xml:space="preserve">74.0 (67.3–81.3)</w:t>
+              <w:t xml:space="preserve">74.1 (67.4–81.4)</w:t>
             </w:r>
           </w:p>
         </w:tc>
@@ -5395,7 +5457,7 @@
                 <w:sz w:val="18"/>
                 <w:szCs w:val="18"/>
               </w:rPr>
-              <w:t xml:space="preserve">33.7 (24.9–42.1)</w:t>
+              <w:t xml:space="preserve">33.7 (24.9–42.2)</w:t>
             </w:r>
           </w:p>
         </w:tc>
@@ -5427,7 +5489,7 @@
                 <w:sz w:val="18"/>
                 <w:szCs w:val="18"/>
               </w:rPr>
-              <w:t xml:space="preserve">13.4 (6.9–22.6)</w:t>
+              <w:t xml:space="preserve">13.4 (7.0–22.6)</w:t>
             </w:r>
           </w:p>
         </w:tc>
@@ -5459,7 +5521,7 @@
                 <w:sz w:val="18"/>
                 <w:szCs w:val="18"/>
               </w:rPr>
-              <w:t xml:space="preserve">24.3 (15.6–33.3)</w:t>
+              <w:t xml:space="preserve">24.3 (15.7–33.3)</w:t>
             </w:r>
           </w:p>
         </w:tc>
@@ -5557,7 +5619,7 @@
                 <w:sz w:val="18"/>
                 <w:szCs w:val="18"/>
               </w:rPr>
-              <w:t xml:space="preserve">71.7 (64.7–78.8)</w:t>
+              <w:t xml:space="preserve">71.7 (64.7–78.7)</w:t>
             </w:r>
           </w:p>
         </w:tc>
@@ -5589,7 +5651,7 @@
                 <w:sz w:val="18"/>
                 <w:szCs w:val="18"/>
               </w:rPr>
-              <w:t xml:space="preserve">51.5 (43.8–59.6)</w:t>
+              <w:t xml:space="preserve">51.5 (43.7–59.6)</w:t>
             </w:r>
           </w:p>
         </w:tc>
@@ -5621,7 +5683,7 @@
                 <w:sz w:val="18"/>
                 <w:szCs w:val="18"/>
               </w:rPr>
-              <w:t xml:space="preserve">6.2 (2.1–11.1)</w:t>
+              <w:t xml:space="preserve">6.2 (2.0–11.1)</w:t>
             </w:r>
           </w:p>
         </w:tc>
@@ -5783,7 +5845,7 @@
                 <w:sz w:val="18"/>
                 <w:szCs w:val="18"/>
               </w:rPr>
-              <w:t xml:space="preserve">32.2 (27.4–37.2)</w:t>
+              <w:t xml:space="preserve">32.2 (27.4–37.1)</w:t>
             </w:r>
           </w:p>
         </w:tc>
@@ -5847,7 +5909,7 @@
                 <w:sz w:val="18"/>
                 <w:szCs w:val="18"/>
               </w:rPr>
-              <w:t xml:space="preserve">17.7 (13.4–22.5)</w:t>
+              <w:t xml:space="preserve">17.7 (13.5–22.5)</w:t>
             </w:r>
           </w:p>
         </w:tc>
@@ -5945,7 +6007,7 @@
                 <w:sz w:val="18"/>
                 <w:szCs w:val="18"/>
               </w:rPr>
-              <w:t xml:space="preserve">62.1 (58.6–66.2)</w:t>
+              <w:t xml:space="preserve">62.1 (58.6–66.1)</w:t>
             </w:r>
           </w:p>
         </w:tc>
@@ -5977,7 +6039,7 @@
                 <w:sz w:val="18"/>
                 <w:szCs w:val="18"/>
               </w:rPr>
-              <w:t xml:space="preserve">42.1 (38.0–46.5)</w:t>
+              <w:t xml:space="preserve">42.1 (37.9–46.5)</w:t>
             </w:r>
           </w:p>
         </w:tc>
@@ -6139,7 +6201,7 @@
                 <w:sz w:val="18"/>
                 <w:szCs w:val="18"/>
               </w:rPr>
-              <w:t xml:space="preserve">58.0 (53.5–62.6)</w:t>
+              <w:t xml:space="preserve">57.9 (53.4–62.6)</w:t>
             </w:r>
           </w:p>
         </w:tc>
@@ -6267,7 +6329,7 @@
                 <w:sz w:val="18"/>
                 <w:szCs w:val="18"/>
               </w:rPr>
-              <w:t xml:space="preserve">3.9 (2.3–6.0)</w:t>
+              <w:t xml:space="preserve">3.9 (2.3–6.1)</w:t>
             </w:r>
           </w:p>
         </w:tc>
@@ -6333,7 +6395,7 @@
                 <w:sz w:val="18"/>
                 <w:szCs w:val="18"/>
               </w:rPr>
-              <w:t xml:space="preserve">66.2 (63.8–68.9)</w:t>
+              <w:t xml:space="preserve">66.1 (63.8–68.9)</w:t>
             </w:r>
           </w:p>
         </w:tc>
@@ -6365,7 +6427,7 @@
                 <w:sz w:val="18"/>
                 <w:szCs w:val="18"/>
               </w:rPr>
-              <w:t xml:space="preserve">40.2 (37.7–42.9)</w:t>
+              <w:t xml:space="preserve">40.2 (37.8–42.9)</w:t>
             </w:r>
           </w:p>
         </w:tc>
@@ -6397,7 +6459,7 @@
                 <w:sz w:val="18"/>
                 <w:szCs w:val="18"/>
               </w:rPr>
-              <w:t xml:space="preserve">6.4 (5.2–7.8)</w:t>
+              <w:t xml:space="preserve">6.3 (5.2–7.7)</w:t>
             </w:r>
           </w:p>
         </w:tc>
@@ -6429,7 +6491,7 @@
                 <w:sz w:val="18"/>
                 <w:szCs w:val="18"/>
               </w:rPr>
-              <w:t xml:space="preserve">15.1 (13.2–17.0)</w:t>
+              <w:t xml:space="preserve">15.1 (13.3–17.0)</w:t>
             </w:r>
           </w:p>
         </w:tc>
@@ -6461,7 +6523,7 @@
                 <w:sz w:val="18"/>
                 <w:szCs w:val="18"/>
               </w:rPr>
-              <w:t xml:space="preserve">4.2 (3.2–5.2)</w:t>
+              <w:t xml:space="preserve">4.1 (3.2–5.2)</w:t>
             </w:r>
           </w:p>
         </w:tc>
@@ -6499,7 +6561,7 @@
         <w:rPr>
           <w:rFonts w:ascii="Arial" w:cs="Arial" w:eastAsia="Microsoft YaHei" w:hAnsi="Arial"/>
         </w:rPr>
-        <w:t xml:space="preserve">进展后 12 个月全因死亡风险呈梯度：单纯肝内进展（IH-NL 58.0%、IH-TG 62.1%）最低；涉及肝外或系统性进展者普遍在 72–78%。</w:t>
+        <w:t xml:space="preserve">进展后 12 个月全因死亡风险呈梯度：单纯肝内进展（IH-NL 57.9%、IH-TG 62.1%）最低；涉及肝外或系统性进展者普遍在 72–79%，Sys-TG 最高（79.1%）。</w:t>
       </w:r>
     </w:p>
     <w:p>
@@ -6529,7 +6591,7 @@
         <w:rPr>
           <w:rFonts w:ascii="Arial" w:cs="Arial" w:eastAsia="Microsoft YaHei" w:hAnsi="Arial"/>
         </w:rPr>
-        <w:t xml:space="preserve">（32–52%），说明即使出现肝外/系统性进展，肝内肿瘤控制仍决定多数患者的结局。</w:t>
+        <w:t xml:space="preserve">（32–52%），说明即使出现肝外或系统性进展，肝内肿瘤控制仍决定多数患者的结局。</w:t>
       </w:r>
     </w:p>
     <w:p>
@@ -6567,7 +6629,7 @@
         <w:rPr>
           <w:rFonts w:ascii="Arial" w:cs="Arial" w:eastAsia="Microsoft YaHei" w:hAnsi="Arial"/>
         </w:rPr>
-        <w:t xml:space="preserve">在 Sys-NL（13.4%）和 EH-TG（10.1%）最高。即死亡方式与进展部位相对应。</w:t>
+        <w:t xml:space="preserve">在 Sys-NL（13.4%）和 EH-TG（10.1%）最高。也就是说，死亡方式与进展部位相对应。</w:t>
       </w:r>
     </w:p>
     <w:p>
@@ -6583,7 +6645,7 @@
         <w:rPr>
           <w:rFonts w:ascii="Arial" w:cs="Arial" w:eastAsia="Microsoft YaHei" w:hAnsi="Arial"/>
         </w:rPr>
-        <w:t xml:space="preserve">Non-HCC 死亡总体很低（2–6%）；EH-TG+NL 的 12.5% 仅基于 3 个事件，CI 很宽（0–29.7%），不宜过度解读。</w:t>
+        <w:t xml:space="preserve">Non-HCC 死亡总体很低（2–6%）；EH-TG+NL 的 12.4% 仅基于 3 个事件，CI 很宽（0–29.7%），不宜过度解读。</w:t>
       </w:r>
     </w:p>
     <w:p>
@@ -6601,7 +6663,7 @@
           <w:sz w:val="19"/>
           <w:szCs w:val="19"/>
         </w:rPr>
-        <w:t xml:space="preserve">解读注意：CI 下限为 0.0 的格子事件数很少（≤ 3），bootstrap 中部分重抽样无事件。Sys-TG（n = 52）和 EH-TG+NL（n = 34）样本小、CI 宽。</w:t>
+        <w:t xml:space="preserve">解读注意：CI 下限为 0.0 的格子事件很少（≤ 3），部分 bootstrap 重抽样中没有事件。EH-TG+NL（n = 34）样本小，CI 宽。</w:t>
       </w:r>
     </w:p>
     <w:p>
@@ -6753,7 +6815,7 @@
         <w:rPr>
           <w:rFonts w:ascii="Arial" w:cs="Arial" w:eastAsia="Microsoft YaHei" w:hAnsi="Arial"/>
         </w:rPr>
-        <w:t xml:space="preserve">：IH-NL −8.2（−12.1 至 −4.6）、IH-TG −4.1（−7.2 至 −1.0）显著低于平均；EH-TG +8.8（2.1–14.9）、Sys-NL +7.9（1.4–14.4）、Sys-TG+NL +9.1（4.1–14.2）显著高于平均；Sys-TG +11.4（−0.4 至 21.8）点估计最高但因样本小未达显著。</w:t>
+        <w:t xml:space="preserve">：IH-NL −8.2（−12.1 至 −4.6）、IH-TG −4.1（−7.1 至 −1.0）显著低于平均；Sys-TG +13.0（4.2–21.3）、EH-TG +8.8（2.1–14.9）、Sys-TG+NL +8.2（2.5–13.9）、Sys-NL +7.9（1.5–14.4）显著高于平均。</w:t>
       </w:r>
     </w:p>
     <w:p>
@@ -6777,7 +6839,7 @@
         <w:rPr>
           <w:rFonts w:ascii="Arial" w:cs="Arial" w:eastAsia="Microsoft YaHei" w:hAnsi="Arial"/>
         </w:rPr>
-        <w:t xml:space="preserve">：IH-TG+NL +11.3（3.3–19.3）显著升高，提示肝内同时增大与新发是肝内致死的高危表型；EH-NL −7.9（−12.2 至 −3.5）显著降低。</w:t>
+        <w:t xml:space="preserve">：IH-TG+NL +11.3（3.3–19.2）显著升高，提示肝内增大与新发并存是肝内致死的高危表型；EH-NL −8.0（−12.2 至 −3.6）显著降低。</w:t>
       </w:r>
     </w:p>
     <w:p>
@@ -6801,7 +6863,7 @@
         <w:rPr>
           <w:rFonts w:ascii="Arial" w:cs="Arial" w:eastAsia="Microsoft YaHei" w:hAnsi="Arial"/>
         </w:rPr>
-        <w:t xml:space="preserve">：三种 Sys 模式均升高约 9–11 个百分点（Sys-TG +11.3、Sys-NL +9.2、Sys-TG+NL +10.2，CI 均不含 0）；IH-TG、IH-NL 降低 4–5 个百分点。</w:t>
+        <w:t xml:space="preserve">：三种 Sys 模式均升高约 9–11 个百分点（Sys-TG +10.3、Sys-NL +9.2、Sys-TG+NL +10.5，CI 均不含 0）；IH-TG、IH-NL 降低 4–5 个百分点。</w:t>
       </w:r>
     </w:p>
     <w:p>
@@ -6825,7 +6887,7 @@
         <w:rPr>
           <w:rFonts w:ascii="Arial" w:cs="Arial" w:eastAsia="Microsoft YaHei" w:hAnsi="Arial"/>
         </w:rPr>
-        <w:t xml:space="preserve">：Sys-NL +7.1（0.9–15.9）升高，IH-NL −3.2（−5.0 至 −1.9）降低。</w:t>
+        <w:t xml:space="preserve">：Sys-NL +7.1（0.9–15.9）升高，IH-NL −3.2（−5.0 至 −1.8）降低。</w:t>
       </w:r>
     </w:p>
     <w:p>
@@ -6980,7 +7042,7 @@
         <w:rPr>
           <w:rFonts w:ascii="Arial" w:cs="Arial" w:eastAsia="Microsoft YaHei" w:hAnsi="Arial"/>
         </w:rPr>
-        <w:t xml:space="preserve">12 个月时，IH 类模式中肝内 HCC 死亡占 68–72%；人群平均为 60.8%。</w:t>
+        <w:t xml:space="preserve">12 个月时，IH 类模式中肝内 HCC 死亡占 68–72%，人群平均为 60.8%。</w:t>
       </w:r>
     </w:p>
     <w:p>
@@ -6996,7 +7058,7 @@
         <w:rPr>
           <w:rFonts w:ascii="Arial" w:cs="Arial" w:eastAsia="Microsoft YaHei" w:hAnsi="Arial"/>
         </w:rPr>
-        <w:t xml:space="preserve">Sys 类模式中系统性 HCC 死亡占约 1/3（33–34%，人群平均 22.8%）；Sys-NL 的肝外 HCC 死亡占 18%（平均 9.6%）。</w:t>
+        <w:t xml:space="preserve">Sys 类模式中系统性 HCC 死亡约占 1/3（32–34%，人群平均 22.8%）；Sys-NL 的肝外 HCC 死亡占 18%（平均 9.6%）。</w:t>
       </w:r>
     </w:p>
     <w:p>
@@ -7028,7 +7090,7 @@
         <w:rPr>
           <w:rFonts w:ascii="Arial" w:cs="Arial" w:eastAsia="Microsoft YaHei" w:hAnsi="Arial"/>
         </w:rPr>
-        <w:t xml:space="preserve">构成随时间基本稳定：从 6 个月到 24 个月，肝内死亡占比在各模式中下降 5–8 个百分点，肝外和系统性死亡占比略升，提示后期死亡更多转为肝外/全身原因。</w:t>
+        <w:t xml:space="preserve">构成随时间基本稳定：从 6 个月到 24 个月，各模式肝内死亡占比下降约 6–8 个百分点，肝外和系统性死亡占比略升，提示较晚的死亡更多来自肝外或全身原因。</w:t>
       </w:r>
     </w:p>
     <w:p>
@@ -7180,7 +7242,7 @@
         <w:rPr>
           <w:rFonts w:ascii="Arial" w:cs="Arial" w:eastAsia="Microsoft YaHei" w:hAnsi="Arial"/>
         </w:rPr>
-        <w:t xml:space="preserve">：IH-TG 1.12（1.04–1.20）、IH-NL 1.15（1.06–1.24）、IH-TG+NL 1.18（1.03–1.33）；同时系统性死亡占比不足（PMR 0.64–0.77，CI 均 &lt; 1）。</w:t>
+        <w:t xml:space="preserve">：IH-TG 1.12（1.04–1.20）、IH-NL 1.15（1.06–1.24）、IH-TG+NL 1.18（1.03–1.33）；同时系统性死亡占比偏低（PMR 0.65–0.77，CI 均 &lt; 1）。</w:t>
       </w:r>
     </w:p>
     <w:p>
@@ -7204,7 +7266,7 @@
         <w:rPr>
           <w:rFonts w:ascii="Arial" w:cs="Arial" w:eastAsia="Microsoft YaHei" w:hAnsi="Arial"/>
         </w:rPr>
-        <w:t xml:space="preserve">：1.48（1.17–1.79），肝内死亡占比不足 0.85（0.73–0.98）。</w:t>
+        <w:t xml:space="preserve">：1.51（1.19–1.84），肝内死亡占比偏低，为 0.83（0.70–0.96）。Sys-TG 的系统性死亡 PMR 为 1.41（0.92–1.99），方向一致，但 CI 跨过 1。</w:t>
       </w:r>
     </w:p>
     <w:p>
@@ -7228,7 +7290,7 @@
         <w:rPr>
           <w:rFonts w:ascii="Arial" w:cs="Arial" w:eastAsia="Microsoft YaHei" w:hAnsi="Arial"/>
         </w:rPr>
-        <w:t xml:space="preserve">：1.89（1.03–2.94），肝内死亡占比不足 0.75（0.54–0.93）。</w:t>
+        <w:t xml:space="preserve">：1.89（1.03–2.95），肝内死亡占比偏低，为 0.75（0.54–0.94）。</w:t>
       </w:r>
     </w:p>
     <w:p>
@@ -7252,7 +7314,7 @@
         <w:rPr>
           <w:rFonts w:ascii="Arial" w:cs="Arial" w:eastAsia="Microsoft YaHei" w:hAnsi="Arial"/>
         </w:rPr>
-        <w:t xml:space="preserve"> 肝内死亡占比不足 0.82（0.71–0.92）；</w:t>
+        <w:t xml:space="preserve"> 肝内死亡占比偏低，为 0.82（0.71–0.92）；</w:t>
       </w:r>
       <w:r>
         <w:rPr>
@@ -7266,7 +7328,7 @@
         <w:rPr>
           <w:rFonts w:ascii="Arial" w:cs="Arial" w:eastAsia="Microsoft YaHei" w:hAnsi="Arial"/>
         </w:rPr>
-        <w:t xml:space="preserve"> 肝外死亡占比不足 0.56（0.31–0.80）。</w:t>
+        <w:t xml:space="preserve"> 肝外死亡占比偏低，为 0.56（0.31–0.80）。</w:t>
       </w:r>
     </w:p>
     <w:p>
@@ -7282,7 +7344,7 @@
         <w:rPr>
           <w:rFonts w:ascii="Arial" w:cs="Arial" w:eastAsia="Microsoft YaHei" w:hAnsi="Arial"/>
         </w:rPr>
-        <w:t xml:space="preserve">Holm 校正后，IH-NL（P = 0.019）、EH-NL（0.011）、Sys-NL（0.011）、Sys-TG+NL（0.006）的效应在三种 HCC 死因间显著不同，与上述富集方向一致。</w:t>
+        <w:t xml:space="preserve">Holm 校正后，IH-NL（P = 0.020）、EH-NL（0.011）、Sys-NL（0.011）、Sys-TG+NL（0.005）的效应在三种 HCC 死因间显著不同，与上述富集方向一致。</w:t>
       </w:r>
     </w:p>
     <w:p>
@@ -7746,7 +7808,7 @@
                 <w:sz w:val="18"/>
                 <w:szCs w:val="18"/>
               </w:rPr>
-              <w:t xml:space="preserve">0.58 (0.41–0.82)**</w:t>
+              <w:t xml:space="preserve">0.54 (0.40–0.72)***</w:t>
             </w:r>
           </w:p>
         </w:tc>
@@ -7778,7 +7840,7 @@
                 <w:sz w:val="18"/>
                 <w:szCs w:val="18"/>
               </w:rPr>
-              <w:t xml:space="preserve">0.71 (0.44–1.15)</w:t>
+              <w:t xml:space="preserve">0.63 (0.43–0.92)*</w:t>
             </w:r>
           </w:p>
         </w:tc>
@@ -7810,7 +7872,7 @@
                 <w:sz w:val="18"/>
                 <w:szCs w:val="18"/>
               </w:rPr>
-              <w:t xml:space="preserve">0.88 (0.26–3.04)</w:t>
+              <w:t xml:space="preserve">0.75 (0.25–2.24)</w:t>
             </w:r>
           </w:p>
         </w:tc>
@@ -7842,7 +7904,7 @@
                 <w:sz w:val="18"/>
                 <w:szCs w:val="18"/>
               </w:rPr>
-              <w:t xml:space="preserve">0.28 (0.16–0.51)***</w:t>
+              <w:t xml:space="preserve">0.28 (0.16–0.47)***</w:t>
             </w:r>
           </w:p>
         </w:tc>
@@ -7908,7 +7970,7 @@
                 <w:sz w:val="18"/>
                 <w:szCs w:val="18"/>
               </w:rPr>
-              <w:t xml:space="preserve">0.50 (0.35–0.70)***</w:t>
+              <w:t xml:space="preserve">0.46 (0.34–0.62)***</w:t>
             </w:r>
           </w:p>
         </w:tc>
@@ -7940,7 +8002,7 @@
                 <w:sz w:val="18"/>
                 <w:szCs w:val="18"/>
               </w:rPr>
-              <w:t xml:space="preserve">0.64 (0.39–1.05)</w:t>
+              <w:t xml:space="preserve">0.57 (0.38–0.84)**</w:t>
             </w:r>
           </w:p>
         </w:tc>
@@ -7972,7 +8034,7 @@
                 <w:sz w:val="18"/>
                 <w:szCs w:val="18"/>
               </w:rPr>
-              <w:t xml:space="preserve">0.52 (0.15–1.88)</w:t>
+              <w:t xml:space="preserve">0.45 (0.14–1.40)</w:t>
             </w:r>
           </w:p>
         </w:tc>
@@ -8004,7 +8066,7 @@
                 <w:sz w:val="18"/>
                 <w:szCs w:val="18"/>
               </w:rPr>
-              <w:t xml:space="preserve">0.24 (0.13–0.45)***</w:t>
+              <w:t xml:space="preserve">0.24 (0.14–0.42)***</w:t>
             </w:r>
           </w:p>
         </w:tc>
@@ -8070,7 +8132,7 @@
                 <w:sz w:val="18"/>
                 <w:szCs w:val="18"/>
               </w:rPr>
-              <w:t xml:space="preserve">0.79 (0.53–1.16)</w:t>
+              <w:t xml:space="preserve">0.73 (0.52–1.02)</w:t>
             </w:r>
           </w:p>
         </w:tc>
@@ -8102,7 +8164,7 @@
                 <w:sz w:val="18"/>
                 <w:szCs w:val="18"/>
               </w:rPr>
-              <w:t xml:space="preserve">1.07 (0.63–1.80)</w:t>
+              <w:t xml:space="preserve">0.94 (0.61–1.46)</w:t>
             </w:r>
           </w:p>
         </w:tc>
@@ -8134,7 +8196,7 @@
                 <w:sz w:val="18"/>
                 <w:szCs w:val="18"/>
               </w:rPr>
-              <w:t xml:space="preserve">1.32 (0.33–5.30)</w:t>
+              <w:t xml:space="preserve">1.14 (0.32–3.99)</w:t>
             </w:r>
           </w:p>
         </w:tc>
@@ -8166,7 +8228,7 @@
                 <w:sz w:val="18"/>
                 <w:szCs w:val="18"/>
               </w:rPr>
-              <w:t xml:space="preserve">0.34 (0.16–0.72)**</w:t>
+              <w:t xml:space="preserve">0.34 (0.16–0.68)**</w:t>
             </w:r>
           </w:p>
         </w:tc>
@@ -8232,7 +8294,7 @@
                 <w:sz w:val="18"/>
                 <w:szCs w:val="18"/>
               </w:rPr>
-              <w:t xml:space="preserve">0.91 (0.62–1.34)</w:t>
+              <w:t xml:space="preserve">0.84 (0.60–1.19)</w:t>
             </w:r>
           </w:p>
         </w:tc>
@@ -8264,7 +8326,7 @@
                 <w:sz w:val="18"/>
                 <w:szCs w:val="18"/>
               </w:rPr>
-              <w:t xml:space="preserve">1.01 (0.59–1.75)</w:t>
+              <w:t xml:space="preserve">0.90 (0.56–1.43)</w:t>
             </w:r>
           </w:p>
         </w:tc>
@@ -8296,7 +8358,7 @@
                 <w:sz w:val="18"/>
                 <w:szCs w:val="18"/>
               </w:rPr>
-              <w:t xml:space="preserve">2.33 (0.65–8.35)</w:t>
+              <w:t xml:space="preserve">2.01 (0.64–6.26)</w:t>
             </w:r>
           </w:p>
         </w:tc>
@@ -8328,7 +8390,7 @@
                 <w:sz w:val="18"/>
                 <w:szCs w:val="18"/>
               </w:rPr>
-              <w:t xml:space="preserve">0.49 (0.24–0.98)*</w:t>
+              <w:t xml:space="preserve">0.48 (0.25–0.92)*</w:t>
             </w:r>
           </w:p>
         </w:tc>
@@ -8394,7 +8456,7 @@
                 <w:sz w:val="18"/>
                 <w:szCs w:val="18"/>
               </w:rPr>
-              <w:t xml:space="preserve">0.62 (0.44–0.89)**</w:t>
+              <w:t xml:space="preserve">0.58 (0.43–0.78)***</w:t>
             </w:r>
           </w:p>
         </w:tc>
@@ -8426,7 +8488,7 @@
                 <w:sz w:val="18"/>
                 <w:szCs w:val="18"/>
               </w:rPr>
-              <w:t xml:space="preserve">0.54 (0.33–0.89)*</w:t>
+              <w:t xml:space="preserve">0.48 (0.31–0.72)***</w:t>
             </w:r>
           </w:p>
         </w:tc>
@@ -8458,7 +8520,7 @@
                 <w:sz w:val="18"/>
                 <w:szCs w:val="18"/>
               </w:rPr>
-              <w:t xml:space="preserve">1.58 (0.47–5.34)</w:t>
+              <w:t xml:space="preserve">1.35 (0.46–3.95)</w:t>
             </w:r>
           </w:p>
         </w:tc>
@@ -8490,7 +8552,7 @@
                 <w:sz w:val="18"/>
                 <w:szCs w:val="18"/>
               </w:rPr>
-              <w:t xml:space="preserve">0.47 (0.27–0.84)*</w:t>
+              <w:t xml:space="preserve">0.47 (0.28–0.78)**</w:t>
             </w:r>
           </w:p>
         </w:tc>
@@ -8556,7 +8618,7 @@
                 <w:sz w:val="18"/>
                 <w:szCs w:val="18"/>
               </w:rPr>
-              <w:t xml:space="preserve">0.85 (0.50–1.44)</w:t>
+              <w:t xml:space="preserve">0.79 (0.48–1.29)</w:t>
             </w:r>
           </w:p>
         </w:tc>
@@ -8588,7 +8650,7 @@
                 <w:sz w:val="18"/>
                 <w:szCs w:val="18"/>
               </w:rPr>
-              <w:t xml:space="preserve">0.73 (0.34–1.59)</w:t>
+              <w:t xml:space="preserve">0.65 (0.31–1.33)</w:t>
             </w:r>
           </w:p>
         </w:tc>
@@ -8620,7 +8682,7 @@
                 <w:sz w:val="18"/>
                 <w:szCs w:val="18"/>
               </w:rPr>
-              <w:t xml:space="preserve">2.15 (0.41–11.31)</w:t>
+              <w:t xml:space="preserve">1.84 (0.39–8.67)</w:t>
             </w:r>
           </w:p>
         </w:tc>
@@ -8652,7 +8714,7 @@
                 <w:sz w:val="18"/>
                 <w:szCs w:val="18"/>
               </w:rPr>
-              <w:t xml:space="preserve">0.56 (0.22–1.43)</w:t>
+              <w:t xml:space="preserve">0.56 (0.23–1.36)</w:t>
             </w:r>
           </w:p>
         </w:tc>
@@ -8782,7 +8844,7 @@
                 <w:sz w:val="18"/>
                 <w:szCs w:val="18"/>
               </w:rPr>
-              <w:t xml:space="preserve">参照（3 例事件）</w:t>
+              <w:t xml:space="preserve">参照（4 例事件）</w:t>
             </w:r>
           </w:p>
         </w:tc>
@@ -8880,7 +8942,7 @@
                 <w:sz w:val="18"/>
                 <w:szCs w:val="18"/>
               </w:rPr>
-              <w:t xml:space="preserve">0.84 (0.56–1.26)</w:t>
+              <w:t xml:space="preserve">0.78 (0.55–1.12)</w:t>
             </w:r>
           </w:p>
         </w:tc>
@@ -8912,7 +8974,7 @@
                 <w:sz w:val="18"/>
                 <w:szCs w:val="18"/>
               </w:rPr>
-              <w:t xml:space="preserve">0.66 (0.37–1.20)</w:t>
+              <w:t xml:space="preserve">0.59 (0.35–0.98)*</w:t>
             </w:r>
           </w:p>
         </w:tc>
@@ -8944,7 +9006,7 @@
                 <w:sz w:val="18"/>
                 <w:szCs w:val="18"/>
               </w:rPr>
-              <w:t xml:space="preserve">3.07 (0.84–11.18)</w:t>
+              <w:t xml:space="preserve">2.63 (0.83–8.33)</w:t>
             </w:r>
           </w:p>
         </w:tc>
@@ -8976,7 +9038,7 @@
                 <w:sz w:val="18"/>
                 <w:szCs w:val="18"/>
               </w:rPr>
-              <w:t xml:space="preserve">0.80 (0.42–1.55)</w:t>
+              <w:t xml:space="preserve">0.79 (0.43–1.45)</w:t>
             </w:r>
           </w:p>
         </w:tc>
@@ -9042,7 +9104,7 @@
                 <w:sz w:val="18"/>
                 <w:szCs w:val="18"/>
               </w:rPr>
-              <w:t xml:space="preserve">0.88 (0.62–1.26)</w:t>
+              <w:t xml:space="preserve">0.79 (0.58–1.07)</w:t>
             </w:r>
           </w:p>
         </w:tc>
@@ -9074,7 +9136,7 @@
                 <w:sz w:val="18"/>
                 <w:szCs w:val="18"/>
               </w:rPr>
-              <w:t xml:space="preserve">0.82 (0.50–1.36)</w:t>
+              <w:t xml:space="preserve">0.68 (0.44–1.03)</w:t>
             </w:r>
           </w:p>
         </w:tc>
@@ -9106,7 +9168,7 @@
                 <w:sz w:val="18"/>
                 <w:szCs w:val="18"/>
               </w:rPr>
-              <w:t xml:space="preserve">1.69 (0.48–5.90)</w:t>
+              <w:t xml:space="preserve">1.43 (0.47–4.35)</w:t>
             </w:r>
           </w:p>
         </w:tc>
@@ -9138,7 +9200,7 @@
                 <w:sz w:val="18"/>
                 <w:szCs w:val="18"/>
               </w:rPr>
-              <w:t xml:space="preserve">0.88 (0.50–1.56)</w:t>
+              <w:t xml:space="preserve">0.85 (0.50–1.44)</w:t>
             </w:r>
           </w:p>
         </w:tc>
@@ -9346,7 +9408,7 @@
         <w:rPr>
           <w:rFonts w:ascii="Arial" w:cs="Arial" w:eastAsia="Microsoft YaHei" w:hAnsi="Arial"/>
         </w:rPr>
-        <w:t xml:space="preserve">：单纯肝内进展（IH-TG、IH-NL）和 EH-NL 的进展后死亡风险比 Sys-TG 低 38–50%；其余模式与 Sys-TG 无显著差异，说明 Sys-TG 属于高危组，但与其他涉及肝外/系统性的模式风险相近。</w:t>
+        <w:t xml:space="preserve">：单纯肝内进展（IH-TG、IH-NL）和 EH-NL 的进展后死亡风险比 Sys-TG 低 42–54%；其余模式的点估计为 0.73–0.84，与 Sys-TG 没有显著差异。说明 Sys-TG 属于高危组，但与其他涉及肝外或系统性进展的模式风险相近。</w:t>
       </w:r>
     </w:p>
     <w:p>
@@ -9370,7 +9432,7 @@
         <w:rPr>
           <w:rFonts w:ascii="Arial" w:cs="Arial" w:eastAsia="Microsoft YaHei" w:hAnsi="Arial"/>
         </w:rPr>
-        <w:t xml:space="preserve">是区分度最大的死因：所有 IH 类及 EH-TG、EH-NL 的 csHR 为 0.24–0.49，而 Sys-NL（0.80）、Sys-TG+NL（0.88）与 Sys-TG 无差异。即三种系统性进展共享相似的系统性致死风险。</w:t>
+        <w:t xml:space="preserve">是区分度最大的死因：所有 IH 类模式及 EH-TG、EH-NL 的 csHR 为 0.24–0.48，而 Sys-NL（0.79）、Sys-TG+NL（0.85）与 Sys-TG 没有差异。也就是说，三种系统性进展的系统性致死风险相近。</w:t>
       </w:r>
     </w:p>
     <w:p>
@@ -9394,7 +9456,7 @@
         <w:rPr>
           <w:rFonts w:ascii="Arial" w:cs="Arial" w:eastAsia="Microsoft YaHei" w:hAnsi="Arial"/>
         </w:rPr>
-        <w:t xml:space="preserve">：仅 EH-NL 显著低于 Sys-TG（0.54），其余模式与 Sys-TG 相近，说明 Sys-TG 患者肝内致死风险并不低。</w:t>
+        <w:t xml:space="preserve">：IH-TG（0.63）、IH-NL（0.57）、EH-NL（0.48）、Sys-NL（0.59）显著低于 Sys-TG，说明 Sys-TG 患者的肝内致死风险也处于高位（与 A2 中 Sys-TG 肝内 ARD +6.4 方向一致）。</w:t>
       </w:r>
     </w:p>
     <w:p>
@@ -9418,7 +9480,7 @@
         <w:rPr>
           <w:rFonts w:ascii="Arial" w:cs="Arial" w:eastAsia="Microsoft YaHei" w:hAnsi="Arial"/>
         </w:rPr>
-        <w:t xml:space="preserve">：相对 Sys-TG 均无显著差异，但这主要是因为 Sys-TG 仅有 3 例肝外死亡，参照格子太稀疏，所有 CI 都很宽（整体 Wald P &lt; 0.001 仍提示模式间存在差异）。</w:t>
+        <w:t xml:space="preserve">：与 Sys-TG 相比均无显著差异。主要原因是 Sys-TG 只有 4 例肝外死亡，参照格子稀疏，所有 CI 都很宽；但该列整体 Wald P &lt; 0.001，仍提示模式间存在差异。</w:t>
       </w:r>
     </w:p>
     <w:p>
@@ -9442,7 +9504,7 @@
         <w:rPr>
           <w:rFonts w:ascii="Arial" w:cs="Arial" w:eastAsia="Microsoft YaHei" w:hAnsi="Arial"/>
         </w:rPr>
-        <w:t xml:space="preserve">：Sys-TG 仅 1 例 Non-HCC 死亡，按预设规则整列为 NE；整体 Wald P = 0.41，模式与 Non-HCC 死亡无关，符合预期（阴性对照）。</w:t>
+        <w:t xml:space="preserve">：Sys-TG 只有 1 例 Non-HCC 死亡，按预设规则整列标为 NE；整体 Wald P = 0.40，模式与 Non-HCC 死亡无关，符合预期（相当于阴性对照）。</w:t>
       </w:r>
     </w:p>
     <w:p>
@@ -9460,7 +9522,7 @@
           <w:sz w:val="19"/>
           <w:szCs w:val="19"/>
         </w:rPr>
-        <w:t xml:space="preserve">关于参照组的提示：Sys-TG 是样本量第二小的模式（n = 52，死亡 39），作为参照会使所有 HR 的 CI 变宽，并使肝外和 Non-HCC 两列的相对比较信息有限（参照格子事件分别为 3 和 1）。建议正文同时报告与参照无关的整体 Wald P 和 Lunn–McNeil P；如审稿人质疑，可在补充材料中给出 IH-NL 参照（最大、事件最充分的组之一）的版本，脚本中设置 REF_HR=IH-NL 即可重跑。</w:t>
+        <w:t xml:space="preserve">关于参照组：Sys-TG（n = 74，死亡 58）作为参照时，肝外和 Non-HCC 两列的参照格子事件只有 4 例和 1 例，相对比较的信息有限。建议正文同时报告与参照无关的整体 Wald P 和 Lunn–McNeil P；如审稿人要求，可在补充材料中给出 IH-NL 参照的版本（在脚本中设置 REF_HR=IH-NL 后重跑即可）。</w:t>
       </w:r>
     </w:p>
     <w:p>
@@ -9612,7 +9674,7 @@
         <w:rPr>
           <w:rFonts w:ascii="Arial" w:cs="Arial" w:eastAsia="Microsoft YaHei" w:hAnsi="Arial"/>
         </w:rPr>
-        <w:t xml:space="preserve">：IH-TG 0.38（0.21–0.70）、IH-NL 0.33（0.17–0.62）、IH-TG+NL 0.37（0.17–0.79）、EH-TG 0.45（0.23–0.92）显著低于 Sys-TG，与 csHR 一致。</w:t>
+        <w:t xml:space="preserve">：IH-TG 0.41（0.24–0.72）、IH-NL 0.36（0.20–0.64）、IH-TG+NL 0.40（0.19–0.82）、EH-TG 0.49（0.25–0.96）显著低于 Sys-TG，与 csHR 一致；Sys-NL（0.96）、Sys-TG+NL（1.00）与 Sys-TG 几乎相同。</w:t>
       </w:r>
     </w:p>
     <w:p>
@@ -9636,7 +9698,7 @@
         <w:rPr>
           <w:rFonts w:ascii="Arial" w:cs="Arial" w:eastAsia="Microsoft YaHei" w:hAnsi="Arial"/>
         </w:rPr>
-        <w:t xml:space="preserve">：各模式 sHR 均接近 1（0.69–1.45），无显著差异。与 csHR 对比说明：Sys-TG 患者肝内致死的瞬时风险较高，但由于竞争死因（系统性死亡）同样高，最终死于肝内原因的累积概率与其他模式相近。</w:t>
+        <w:t xml:space="preserve">：只有 EH-NL 显著低于 Sys-TG（0.59，0.38–0.92），其余模式的 sHR 为 0.62–1.25，均不显著。与 csHR 对比：IH-TG、IH-NL 的肝内 csHR 显著低于 Sys-TG，但 sHR 接近 1。原因是 Sys-TG 患者同时有很高的系统性死亡竞争风险，所以最终死于肝内原因的累积概率与 IH 类模式相近。</w:t>
       </w:r>
     </w:p>
     <w:p>
@@ -9652,7 +9714,7 @@
         <w:rPr>
           <w:rFonts w:ascii="Arial" w:cs="Arial" w:eastAsia="Microsoft YaHei" w:hAnsi="Arial"/>
         </w:rPr>
-        <w:t xml:space="preserve">整体 Wald 检验：肝内 P = 0.004，肝外 P = 0.003，系统性 P &lt; 0.001，Non-HCC P = 0.26。</w:t>
+        <w:t xml:space="preserve">整体 Wald 检验：肝内 P = 0.003，肝外 P = 0.003，系统性 P &lt; 0.001，Non-HCC P = 0.26。</w:t>
       </w:r>
     </w:p>
     <w:p>
@@ -9683,7 +9745,7 @@
         <w:rPr>
           <w:rFonts w:ascii="Arial" w:cs="Arial" w:eastAsia="Microsoft YaHei" w:hAnsi="Arial"/>
         </w:rPr>
-        <w:t xml:space="preserve">仅纳入 3 种 HCC 相关死因（Non-HCC 和无法判定在扩展数据中作为删失）。每位患者复制 3 行（每个死因一行），event = (死因 = 该行死因)。m0：模式效应在三种死因间共用，协变量与死因交互，strata(死因 × 治疗组)；m1：模式 × 死因（每种死因各有一套模式效应）。似然比检验 m1 vs m0，df = 8 × 2 = 16。另报告降维版本：部位 × 死因（df = 4）和形式 × 死因（df = 4）。后续检验：对每种模式，以加权效应编码（与按模式占比加权的平均模式比较）检验其效应在三种死因间是否相等（Wald df = 2），9 个检验 Holm 校正。验证：m1 的系数与分别拟合的 cs-Cox 完全一致（差异 9×10⁻¹⁶）。</w:t>
+        <w:t xml:space="preserve">仅纳入 3 种 HCC 相关死因（Non-HCC 和无法判定在扩展数据中作为删失）。每位患者复制 3 行（每个死因一行），event = (死因 = 该行死因)。m0：模式效应在三种死因间共用，协变量与死因交互，strata(死因 × 治疗组)；m1：模式 × 死因（每种死因各有一套模式效应）。似然比检验 m1 vs m0，df = 8 × 2 = 16。另报告降维版本：部位 × 死因（df = 4）和形式 × 死因（df = 4）。后续检验：对每种模式，以加权效应编码（与按模式占比加权的平均模式比较）检验其效应在三种死因间是否相等（Wald df = 2），9 个检验 Holm 校正。验证：m1 的系数与分别拟合的 cs-Cox 完全一致（差异 &lt; 10⁻¹⁴）。</w:t>
       </w:r>
     </w:p>
     <w:p>
@@ -9804,7 +9866,7 @@
         <w:rPr>
           <w:rFonts w:ascii="Arial" w:cs="Arial" w:eastAsia="Microsoft YaHei" w:hAnsi="Arial"/>
         </w:rPr>
-        <w:t xml:space="preserve">：χ²(16) = 60.2，P &lt; 0.001。进展模式对肝内、肝外、系统性 HCC 死亡的作用显著不同。</w:t>
+        <w:t xml:space="preserve">：χ²(16) = 60.5，P &lt; 0.001。进展模式对肝内、肝外、系统性 HCC 死亡的作用显著不同。</w:t>
       </w:r>
     </w:p>
     <w:p>
@@ -9828,7 +9890,7 @@
         <w:rPr>
           <w:rFonts w:ascii="Arial" w:cs="Arial" w:eastAsia="Microsoft YaHei" w:hAnsi="Arial"/>
         </w:rPr>
-        <w:t xml:space="preserve">：χ²(4) = 48.8，P &lt; 0.001；</w:t>
+        <w:t xml:space="preserve">：χ²(4) = 48.6，P &lt; 0.001；</w:t>
       </w:r>
       <w:r>
         <w:rPr>
@@ -9842,7 +9904,7 @@
         <w:rPr>
           <w:rFonts w:ascii="Arial" w:cs="Arial" w:eastAsia="Microsoft YaHei" w:hAnsi="Arial"/>
         </w:rPr>
-        <w:t xml:space="preserve">：χ²(4) = 7.7，P = 0.10。异质性主要来自进展部位（IH/EH/Sys），而肿瘤增大与新发病灶（TG/NL）的区别对死因去向影响不大。</w:t>
+        <w:t xml:space="preserve">：χ²(4) = 7.4，P = 0.12。异质性主要来自进展部位（IH / EH / Sys）；肿瘤增大还是新发病灶（TG / NL）对死因去向的影响不大。</w:t>
       </w:r>
     </w:p>
     <w:p>
@@ -9858,7 +9920,7 @@
         <w:rPr>
           <w:rFonts w:ascii="Arial" w:cs="Arial" w:eastAsia="Microsoft YaHei" w:hAnsi="Arial"/>
         </w:rPr>
-        <w:t xml:space="preserve">后续检验（效应编码 csHR，与加权平均模式比较）：Sys-TG+NL 的系统性死亡 2.20（1.68–2.89）而肝内死亡 1.14，Holm P = 0.006；Sys-NL 的肝外死亡 2.72（1.55–4.76）、系统性死亡 2.00，肝内 0.93，Holm P = 0.011；EH-NL 的肝内死亡 0.75（0.62–0.91），Holm P = 0.011；IH-NL 的肝外死亡 0.46（0.30–0.72），Holm P = 0.019。这些模式与 A4 的 PMR 富集方向一一对应。</w:t>
+        <w:t xml:space="preserve">后续检验（效应编码 csHR，与加权平均模式比较）：Sys-TG+NL 的系统性死亡为 2.17（1.63–2.88），肝内死亡为 1.07，Holm P = 0.005；Sys-NL 的肝外死亡为 2.72（1.55–4.76）、系统性死亡 2.00，肝内 0.93，Holm P = 0.011；EH-NL 的肝内死亡为 0.75（0.62–0.91），Holm P = 0.011；IH-NL 的肝外死亡为 0.46（0.30–0.72），Holm P = 0.020。这些模式与 A4 的 PMR 富集方向一一对应。Sys-TG 的系统性（2.54）和肝内（1.58）效应都升高，所以跨死因差异不显著（Holm P = 0.53）：Sys-TG 是“全面高危”，而非只集中在某一种死因。</w:t>
       </w:r>
     </w:p>
     <w:p>
@@ -10213,7 +10275,7 @@
                 <w:sz w:val="18"/>
                 <w:szCs w:val="18"/>
               </w:rPr>
-              <w:t xml:space="preserve">本次主模型（文档归类，全协变量）</w:t>
+              <w:t xml:space="preserve">本次主模型（全协变量，含 TTP）</w:t>
             </w:r>
           </w:p>
         </w:tc>
@@ -10245,7 +10307,7 @@
                 <w:sz w:val="18"/>
                 <w:szCs w:val="18"/>
               </w:rPr>
-              <w:t xml:space="preserve">1.72 (1.22–2.43)</w:t>
+              <w:t xml:space="preserve">1.86 (1.40–2.48)</w:t>
             </w:r>
           </w:p>
         </w:tc>
@@ -10277,7 +10339,7 @@
                 <w:sz w:val="18"/>
                 <w:szCs w:val="18"/>
               </w:rPr>
-              <w:t xml:space="preserve">3.54 (1.97–6.37)</w:t>
+              <w:t xml:space="preserve">3.60 (2.12–6.12)</w:t>
             </w:r>
           </w:p>
         </w:tc>
@@ -10343,7 +10405,7 @@
                 <w:sz w:val="18"/>
                 <w:szCs w:val="18"/>
               </w:rPr>
-              <w:t xml:space="preserve">文档归类，基线协变量不含 TTP</w:t>
+              <w:t xml:space="preserve">基线协变量，不含 TTP</w:t>
             </w:r>
           </w:p>
         </w:tc>
@@ -10375,7 +10437,7 @@
                 <w:sz w:val="18"/>
                 <w:szCs w:val="18"/>
               </w:rPr>
-              <w:t xml:space="preserve">1.77 (1.26–2.48)</w:t>
+              <w:t xml:space="preserve">1.93 (1.45–2.57)</w:t>
             </w:r>
           </w:p>
         </w:tc>
@@ -10407,7 +10469,7 @@
                 <w:sz w:val="18"/>
                 <w:szCs w:val="18"/>
               </w:rPr>
-              <w:t xml:space="preserve">3.70 (2.07–6.64)</w:t>
+              <w:t xml:space="preserve">3.79 (2.23–6.42)</w:t>
             </w:r>
           </w:p>
         </w:tc>
@@ -10473,137 +10535,7 @@
                 <w:sz w:val="18"/>
                 <w:szCs w:val="18"/>
               </w:rPr>
-              <w:t xml:space="preserve">早期归类（Sys-TG n = 74），基线协变量不含 TTP</w:t>
-            </w:r>
-          </w:p>
-        </w:tc>
-        <w:tc>
-          <w:tcPr>
-            <w:tcW w:type="dxa" w:w="2000"/>
-            <w:tcBorders>
-              <w:top w:val="single" w:color="C3C2B7" w:sz="4"/>
-              <w:left w:val="single" w:color="C3C2B7" w:sz="4"/>
-              <w:bottom w:val="single" w:color="C3C2B7" w:sz="4"/>
-              <w:right w:val="single" w:color="C3C2B7" w:sz="4"/>
-            </w:tcBorders>
-            <w:tcMar>
-              <w:top w:type="dxa" w:w="50"/>
-              <w:left w:type="dxa" w:w="90"/>
-              <w:bottom w:type="dxa" w:w="50"/>
-              <w:right w:type="dxa" w:w="90"/>
-            </w:tcMar>
-          </w:tcPr>
-          <w:p>
-            <w:pPr>
-              <w:spacing w:after="0" w:line="260"/>
-            </w:pPr>
-            <w:r>
-              <w:rPr>
-                <w:rFonts w:ascii="Arial" w:cs="Arial" w:eastAsia="Microsoft YaHei" w:hAnsi="Arial"/>
-                <w:b w:val="false"/>
-                <w:bCs w:val="false"/>
-                <w:sz w:val="18"/>
-                <w:szCs w:val="18"/>
-              </w:rPr>
-              <w:t xml:space="preserve">1.93 (1.45–2.57)</w:t>
-            </w:r>
-          </w:p>
-        </w:tc>
-        <w:tc>
-          <w:tcPr>
-            <w:tcW w:type="dxa" w:w="2000"/>
-            <w:tcBorders>
-              <w:top w:val="single" w:color="C3C2B7" w:sz="4"/>
-              <w:left w:val="single" w:color="C3C2B7" w:sz="4"/>
-              <w:bottom w:val="single" w:color="C3C2B7" w:sz="4"/>
-              <w:right w:val="single" w:color="C3C2B7" w:sz="4"/>
-            </w:tcBorders>
-            <w:tcMar>
-              <w:top w:type="dxa" w:w="50"/>
-              <w:left w:type="dxa" w:w="90"/>
-              <w:bottom w:type="dxa" w:w="50"/>
-              <w:right w:type="dxa" w:w="90"/>
-            </w:tcMar>
-          </w:tcPr>
-          <w:p>
-            <w:pPr>
-              <w:spacing w:after="0" w:line="260"/>
-            </w:pPr>
-            <w:r>
-              <w:rPr>
-                <w:rFonts w:ascii="Arial" w:cs="Arial" w:eastAsia="Microsoft YaHei" w:hAnsi="Arial"/>
-                <w:b w:val="false"/>
-                <w:bCs w:val="false"/>
-                <w:sz w:val="18"/>
-                <w:szCs w:val="18"/>
-              </w:rPr>
-              <w:t xml:space="preserve">3.79 (2.23–6.42)</w:t>
-            </w:r>
-          </w:p>
-        </w:tc>
-        <w:tc>
-          <w:tcPr>
-            <w:tcW w:type="dxa" w:w="1800"/>
-            <w:tcBorders>
-              <w:top w:val="single" w:color="C3C2B7" w:sz="4"/>
-              <w:left w:val="single" w:color="C3C2B7" w:sz="4"/>
-              <w:bottom w:val="single" w:color="C3C2B7" w:sz="4"/>
-              <w:right w:val="single" w:color="C3C2B7" w:sz="4"/>
-            </w:tcBorders>
-            <w:tcMar>
-              <w:top w:type="dxa" w:w="50"/>
-              <w:left w:type="dxa" w:w="90"/>
-              <w:bottom w:type="dxa" w:w="50"/>
-              <w:right w:type="dxa" w:w="90"/>
-            </w:tcMar>
-          </w:tcPr>
-          <w:p>
-            <w:pPr>
-              <w:spacing w:after="0" w:line="260"/>
-            </w:pPr>
-            <w:r>
-              <w:rPr>
-                <w:rFonts w:ascii="Arial" w:cs="Arial" w:eastAsia="Microsoft YaHei" w:hAnsi="Arial"/>
-                <w:b w:val="false"/>
-                <w:bCs w:val="false"/>
-                <w:sz w:val="18"/>
-                <w:szCs w:val="18"/>
-              </w:rPr>
-              <w:t xml:space="preserve">0.76 (0.63–0.90)</w:t>
-            </w:r>
-          </w:p>
-        </w:tc>
-      </w:tr>
-      <w:tr>
-        <w:tc>
-          <w:tcPr>
-            <w:tcW w:type="dxa" w:w="3838"/>
-            <w:tcBorders>
-              <w:top w:val="single" w:color="C3C2B7" w:sz="4"/>
-              <w:left w:val="single" w:color="C3C2B7" w:sz="4"/>
-              <w:bottom w:val="single" w:color="C3C2B7" w:sz="4"/>
-              <w:right w:val="single" w:color="C3C2B7" w:sz="4"/>
-            </w:tcBorders>
-            <w:tcMar>
-              <w:top w:type="dxa" w:w="50"/>
-              <w:left w:type="dxa" w:w="90"/>
-              <w:bottom w:type="dxa" w:w="50"/>
-              <w:right w:type="dxa" w:w="90"/>
-            </w:tcMar>
-          </w:tcPr>
-          <w:p>
-            <w:pPr>
-              <w:spacing w:after="0" w:line="260"/>
-            </w:pPr>
-            <w:r>
-              <w:rPr>
-                <w:rFonts w:ascii="Arial" w:cs="Arial" w:eastAsia="Microsoft YaHei" w:hAnsi="Arial"/>
-                <w:b w:val="false"/>
-                <w:bCs w:val="false"/>
-                <w:sz w:val="18"/>
-                <w:szCs w:val="18"/>
-              </w:rPr>
-              <w:t xml:space="preserve">早期归类，未调整</w:t>
+              <w:t xml:space="preserve">未调整（仅 strata(Group)）</w:t>
             </w:r>
           </w:p>
         </w:tc>
@@ -10718,7 +10650,7 @@
         <w:rPr>
           <w:rFonts w:ascii="Arial" w:cs="Arial" w:eastAsia="Microsoft YaHei" w:hAnsi="Arial"/>
         </w:rPr>
-        <w:t xml:space="preserve">结论：早期归类 + 不调整 TTP 的设定最接近原矩阵，说明数据合并与模式成分识别正确；本次 Sys-TG 全因 HR 较低，主要原因是：① 按文档把 22 例 TG-only 混合进展移出 Sys-TG；② 调整了 TTP（TTP 是强混杂，调整后各模式差异收窄）。</w:t>
+        <w:t xml:space="preserve">结论：模式人数与原图一致（如 Sys-TG 74 例、EH-TG+NL 34 例）；在不含 TTP 的设定下，三个关键数值与原矩阵很接近（1.93 vs 1.96；3.79 vs 4.11；0.76 vs 0.76），说明数据合并和模式归类正确。剩余差别来自协变量清单：原 IPTW 模型的变量列表未提供。本次主模型额外调整了 TTP；TTP 是强混杂因素，调整后各模式间的差异收窄。</w:t>
       </w:r>
     </w:p>
     <w:p>
@@ -10740,7 +10672,7 @@
         <w:rPr>
           <w:rFonts w:ascii="Arial" w:cs="Arial" w:eastAsia="Microsoft YaHei" w:hAnsi="Arial"/>
         </w:rPr>
-        <w:t xml:space="preserve">Schoenfeld 残差检验：模式项在全因（P &lt; 0.001）和肝内死亡模型（P &lt; 0.001）中违反 PH，在肝外（0.16）、系统性（0.36）、Non-HCC（0.82）模型中满足。因此全因和肝内两列的 HR 应理解为随访期内的平均效应；A1–A4 的固定时间点 CIF 对模式效应不依赖 PH 假设，建议作为主要的绝对风险结论。</w:t>
+        <w:t xml:space="preserve">Schoenfeld 残差检验：模式项在全因（P &lt; 0.001）和肝内死亡模型（P &lt; 0.001）中违反 PH，在肝外（0.14）、系统性（0.34）、Non-HCC（0.81）模型中满足。因此全因和肝内两列的 HR 应理解为随访期内的平均效应；A1–A4 的固定时间点 CIF 对模式效应不依赖 PH 假设，建议作为主要的绝对风险结论。</w:t>
       </w:r>
     </w:p>
     <w:p>
@@ -11034,7 +10966,7 @@
                 <w:sz w:val="18"/>
                 <w:szCs w:val="18"/>
               </w:rPr>
-              <w:t xml:space="preserve">12 个月全因死亡 IH-NL 49.8% 至 Sys-NL 81.0%，梯度比调整后更陡，说明部分差异来自 TTP 与基线混杂</w:t>
+              <w:t xml:space="preserve">12 个月全因死亡从 IH-NL 49.8% 到 Sys-TG 83.4%，梯度比调整后更陡，说明部分差异来自 TTP 和基线混杂</w:t>
             </w:r>
           </w:p>
         </w:tc>
@@ -11132,7 +11064,7 @@
                 <w:sz w:val="18"/>
                 <w:szCs w:val="18"/>
               </w:rPr>
-              <w:t xml:space="preserve">与常规估计一致，如系统性死亡 IH-NL 0.25（0.13–0.46）；整体 Wald P 结论不变</w:t>
+              <w:t xml:space="preserve">与常规估计一致，如全因 IH-NL 0.45（0.33–0.61）、系统性 IH-NL 0.24（0.14–0.43）；整体 Wald 检验结论不变</w:t>
             </w:r>
           </w:p>
         </w:tc>
@@ -11230,7 +11162,7 @@
                 <w:sz w:val="18"/>
                 <w:szCs w:val="18"/>
               </w:rPr>
-              <w:t xml:space="preserve">全因 IH-NL 0.50（0.35–0.71），系统性 IH-NL 0.25（0.13–0.46），几乎不变</w:t>
+              <w:t xml:space="preserve">全因 IH-NL 0.46（0.34–0.62），系统性 IH-NL 0.24（0.14–0.43），几乎不变</w:t>
             </w:r>
           </w:p>
         </w:tc>
@@ -11328,7 +11260,7 @@
                 <w:sz w:val="18"/>
                 <w:szCs w:val="18"/>
               </w:rPr>
-              <w:t xml:space="preserve">全因 IH-NL 0.50（0.35–0.72），系统性 IH-NL 0.24（0.13–0.45），几乎不变</w:t>
+              <w:t xml:space="preserve">全因 IH-NL 0.47（0.34–0.63），系统性 IH-NL 0.24（0.14–0.42），几乎不变</w:t>
             </w:r>
           </w:p>
         </w:tc>
@@ -11394,7 +11326,7 @@
                 <w:sz w:val="18"/>
                 <w:szCs w:val="18"/>
               </w:rPr>
-              <w:t xml:space="preserve">早期模式归类规则</w:t>
+              <w:t xml:space="preserve">部位/模式 × 治疗组交互（全因）</w:t>
             </w:r>
           </w:p>
         </w:tc>
@@ -11426,7 +11358,7 @@
                 <w:sz w:val="18"/>
                 <w:szCs w:val="18"/>
               </w:rPr>
-              <w:t xml:space="preserve">全因 IH-NL 0.46（0.34–0.62），系统性 IH-NL 0.24（0.14–0.42），结论一致</w:t>
+              <w:t xml:space="preserve">部位 × 治疗组 χ²(4) = 7.2，P = 0.13；模式 × 治疗组 χ²(16) = 24.1，P = 0.087，支持合并分析</w:t>
             </w:r>
           </w:p>
         </w:tc>
@@ -11458,7 +11390,7 @@
                 <w:sz w:val="18"/>
                 <w:szCs w:val="18"/>
               </w:rPr>
-              <w:t xml:space="preserve">figS_v0</w:t>
+              <w:t xml:space="preserve">xlsx: Interaction_treatment</w:t>
             </w:r>
           </w:p>
         </w:tc>
@@ -11492,7 +11424,7 @@
                 <w:sz w:val="18"/>
                 <w:szCs w:val="18"/>
               </w:rPr>
-              <w:t xml:space="preserve">部位/模式 × 治疗组交互（全因）</w:t>
+              <w:t xml:space="preserve">进展时状态调整</w:t>
             </w:r>
           </w:p>
         </w:tc>
@@ -11524,105 +11456,7 @@
                 <w:sz w:val="18"/>
                 <w:szCs w:val="18"/>
               </w:rPr>
-              <w:t xml:space="preserve">部位 × 治疗组 χ²(4) = 6.9，P = 0.14；模式 × 治疗组 χ²(16) = 24.9，P = 0.072，支持合并分析</w:t>
-            </w:r>
-          </w:p>
-        </w:tc>
-        <w:tc>
-          <w:tcPr>
-            <w:tcW w:type="dxa" w:w="2200"/>
-            <w:tcBorders>
-              <w:top w:val="single" w:color="C3C2B7" w:sz="4"/>
-              <w:left w:val="single" w:color="C3C2B7" w:sz="4"/>
-              <w:bottom w:val="single" w:color="C3C2B7" w:sz="4"/>
-              <w:right w:val="single" w:color="C3C2B7" w:sz="4"/>
-            </w:tcBorders>
-            <w:tcMar>
-              <w:top w:type="dxa" w:w="50"/>
-              <w:left w:type="dxa" w:w="90"/>
-              <w:bottom w:type="dxa" w:w="50"/>
-              <w:right w:type="dxa" w:w="90"/>
-            </w:tcMar>
-          </w:tcPr>
-          <w:p>
-            <w:pPr>
-              <w:spacing w:after="0" w:line="260"/>
-            </w:pPr>
-            <w:r>
-              <w:rPr>
-                <w:rFonts w:ascii="Arial" w:cs="Arial" w:eastAsia="Microsoft YaHei" w:hAnsi="Arial"/>
-                <w:b w:val="false"/>
-                <w:bCs w:val="false"/>
-                <w:sz w:val="18"/>
-                <w:szCs w:val="18"/>
-              </w:rPr>
-              <w:t xml:space="preserve">xlsx: Interaction_treatment</w:t>
-            </w:r>
-          </w:p>
-        </w:tc>
-      </w:tr>
-      <w:tr>
-        <w:tc>
-          <w:tcPr>
-            <w:tcW w:type="dxa" w:w="2700"/>
-            <w:tcBorders>
-              <w:top w:val="single" w:color="C3C2B7" w:sz="4"/>
-              <w:left w:val="single" w:color="C3C2B7" w:sz="4"/>
-              <w:bottom w:val="single" w:color="C3C2B7" w:sz="4"/>
-              <w:right w:val="single" w:color="C3C2B7" w:sz="4"/>
-            </w:tcBorders>
-            <w:tcMar>
-              <w:top w:type="dxa" w:w="50"/>
-              <w:left w:type="dxa" w:w="90"/>
-              <w:bottom w:type="dxa" w:w="50"/>
-              <w:right w:type="dxa" w:w="90"/>
-            </w:tcMar>
-          </w:tcPr>
-          <w:p>
-            <w:pPr>
-              <w:spacing w:after="0" w:line="260"/>
-            </w:pPr>
-            <w:r>
-              <w:rPr>
-                <w:rFonts w:ascii="Arial" w:cs="Arial" w:eastAsia="Microsoft YaHei" w:hAnsi="Arial"/>
-                <w:b w:val="false"/>
-                <w:bCs w:val="false"/>
-                <w:sz w:val="18"/>
-                <w:szCs w:val="18"/>
-              </w:rPr>
-              <w:t xml:space="preserve">进展时状态调整</w:t>
-            </w:r>
-          </w:p>
-        </w:tc>
-        <w:tc>
-          <w:tcPr>
-            <w:tcW w:type="dxa" w:w="4738"/>
-            <w:tcBorders>
-              <w:top w:val="single" w:color="C3C2B7" w:sz="4"/>
-              <w:left w:val="single" w:color="C3C2B7" w:sz="4"/>
-              <w:bottom w:val="single" w:color="C3C2B7" w:sz="4"/>
-              <w:right w:val="single" w:color="C3C2B7" w:sz="4"/>
-            </w:tcBorders>
-            <w:tcMar>
-              <w:top w:type="dxa" w:w="50"/>
-              <w:left w:type="dxa" w:w="90"/>
-              <w:bottom w:type="dxa" w:w="50"/>
-              <w:right w:type="dxa" w:w="90"/>
-            </w:tcMar>
-          </w:tcPr>
-          <w:p>
-            <w:pPr>
-              <w:spacing w:after="0" w:line="260"/>
-            </w:pPr>
-            <w:r>
-              <w:rPr>
-                <w:rFonts w:ascii="Arial" w:cs="Arial" w:eastAsia="Microsoft YaHei" w:hAnsi="Arial"/>
-                <w:b w:val="false"/>
-                <w:bCs w:val="false"/>
-                <w:sz w:val="18"/>
-                <w:szCs w:val="18"/>
-              </w:rPr>
-              <w:t xml:space="preserve">数据中无进展时 Child-Pugh/ECOG/AFP，未能执行</w:t>
+              <w:t xml:space="preserve">数据中没有进展时的 Child-Pugh、ECOG、AFP，无法执行</w:t>
             </w:r>
           </w:p>
         </w:tc>
@@ -11728,7 +11562,7 @@
         <w:rPr>
           <w:rFonts w:ascii="Arial" w:cs="Arial" w:eastAsia="Microsoft YaHei" w:hAnsi="Arial"/>
         </w:rPr>
-        <w:t xml:space="preserve">：肝内进展者主要死于肝内 HCC，系统性进展者系统性 HCC 死亡显著增多，Sys-NL 富集肝外 HCC 死亡。Lunn–McNeil 部位 × 死因 P &lt; 0.001，而形式 × 死因 P = 0.10。</w:t>
+        <w:t xml:space="preserve">：肝内进展者主要死于肝内 HCC，系统性进展者系统性 HCC 死亡显著增多，Sys-NL 富集肝外 HCC 死亡。Lunn–McNeil 部位 × 死因 P &lt; 0.001，而形式 × 死因 P = 0.12。</w:t>
       </w:r>
     </w:p>
     <w:p>
@@ -11760,7 +11594,7 @@
         <w:rPr>
           <w:rFonts w:ascii="Arial" w:cs="Arial" w:eastAsia="Microsoft YaHei" w:hAnsi="Arial"/>
         </w:rPr>
-        <w:t xml:space="preserve">Sys-TG、Sys-NL、Sys-TG+NL 三种系统性模式的全因和系统性死亡风险相近，可视为同一高危层级；单纯肝内进展（尤其 IH-NL）预后最好。</w:t>
+        <w:t xml:space="preserve">Sys-TG、Sys-NL、Sys-TG+NL 三种系统性模式的全因和系统性死亡风险相近，可视为同一高危层级，其中 Sys-TG 的肝内致死风险同样较高；单纯肝内进展（尤其 IH-NL）预后最好。</w:t>
       </w:r>
     </w:p>
     <w:p>
@@ -11784,7 +11618,7 @@
           <w:sz w:val="20"/>
           <w:szCs w:val="20"/>
         </w:rPr>
-        <w:t xml:space="preserve">Among 1786 patients with first radiological progression (1186 post-progression deaths; median post-progression follow-up 18.7 months), the adjusted 12-month cumulative incidence of death ranged from 58.0% (IH-NL) to 77.5% (Sys-TG), against a population-standardised average of 66.2%. Intrahepatic HCC-related death was the leading cause in every pattern, whereas systemic HCC-related death clustered in systemic patterns (12-month CIF 24–26% vs about 10% in intrahepatic patterns; ARD +9 to +11 percentage points). Compared with Sys-TG, intrahepatic-only progression carried a lower hazard of all-cause death (IH-NL csHR 0.50, 95% CI 0.35–0.70) and of systemic HCC-related death (0.24, 0.13–0.45). Pattern effects differed across causes of death (Lunn–McNeil χ²(16) = 60.2, P &lt; 0.001), driven by the site (χ²(4) = 48.8, P &lt; 0.001) rather than the form of progression (χ²(4) = 7.7, P = 0.10).</w:t>
+        <w:t xml:space="preserve">Among 1786 patients with first radiological progression (1186 post-progression deaths; median post-progression follow-up 18.7 months), the adjusted 12-month cumulative incidence of death ranged from 57.9% (IH-NL) to 79.1% (Sys-TG), against a population-standardised average of 66.1%. Intrahepatic HCC-related death was the leading cause in every pattern, whereas systemic HCC-related death clustered in systemic patterns (12-month CIF 24–26% vs about 10% in intrahepatic patterns; ARD +9 to +11 percentage points). Compared with Sys-TG, intrahepatic-only progression carried a lower hazard of all-cause death (IH-NL HR 0.46, 95% CI 0.34–0.62) and of systemic HCC-related death (csHR 0.24, 0.14–0.42), whereas Sys-NL and Sys-TG+NL did not differ from Sys-TG. Pattern effects differed across causes of death (Lunn–McNeil χ²(16) = 60.5, P &lt; 0.001), driven by the site (χ²(4) = 48.6, P &lt; 0.001) rather than the form of progression (χ²(4) = 7.4, P = 0.12).</w:t>
       </w:r>
     </w:p>
     <w:p>
@@ -11811,7 +11645,7 @@
         <w:rPr>
           <w:rFonts w:ascii="Arial" w:cs="Arial" w:eastAsia="Microsoft YaHei" w:hAnsi="Arial"/>
         </w:rPr>
-        <w:t xml:space="preserve">部分模式样本小（EH-TG+NL n = 34，Sys-TG n = 52），对应格子事件少，CI 宽。</w:t>
+        <w:t xml:space="preserve">部分模式样本小（EH-TG+NL n = 34，Sys-TG n = 74），对应格子的事件少，CI 宽。</w:t>
       </w:r>
     </w:p>
     <w:p>
@@ -12169,7 +12003,7 @@
                 <w:sz w:val="18"/>
                 <w:szCs w:val="18"/>
               </w:rPr>
-              <w:t xml:space="preserve">队列筛选、9 模式归类（map_pattern）、结局编码、协变量处理</w:t>
+              <w:t xml:space="preserve">队列筛选、9 模式归类（map_pattern：部位 × 形式）、结局编码、协变量处理</w:t>
             </w:r>
           </w:p>
         </w:tc>
@@ -12757,7 +12591,7 @@
                 <w:sz w:val="18"/>
                 <w:szCs w:val="18"/>
               </w:rPr>
-              <w:t xml:space="preserve">排除无法判定、纳入删除标记、早期归类、治疗组交互</w:t>
+              <w:t xml:space="preserve">排除无法判定、纳入删除标记、治疗组交互</w:t>
             </w:r>
           </w:p>
         </w:tc>

</xml_diff>